<commit_message>
Yedi örnekten çıkan düzeltmeler: kök eşleme, marka tanıma, harita eşleşmesi, gam özeti, zayıf sahip ve link kuralları; yeni örnekler
Co-Authored-By: Claude Fable 5.1 <noreply@anthropic.com>
</commit_message>
<xml_diff>
--- a/examples/ornek-icerik-kadin-mont.docx
+++ b/examples/ornek-icerik-kadin-mont.docx
@@ -1265,7 +1265,7 @@
           <w:color w:val="1A1A1A"/>
           <w:sz w:val="21"/>
         </w:rPr>
-        <w:t>Montu çoğu zaman kendi bedeninizde seçebilirsiniz; dar kalıplı modellerde içine giyeceğiniz kazağı hesaba katmanız yeterlidir. Klasik kalıplı montlarda omuz dikişi omuz kemiğine oturur; düşük omuzlu ve oversize kesimlerde göğüs genişliğine ve kol boyuna bakılır. Kalıplar markadan markaya değiştiği için ürün sayfasındaki beden tablosu en güvenilir kaynaktır. Boy tercihini ise kullanım belirler: bel hizasında biten kısa montlar yürürken ve araç kullanırken hareketi kısıtlamaz, kalçayı örten uzun montlar rüzgârı daha iyi keser.</w:t>
+        <w:t>Montu çoğu zaman kendi bedeninizde seçebilirsiniz; dar kalıplı modellerde içine giyeceğiniz kazağı hesaba katmanız yeterlidir. Klasik kalıplı montlarda omuz dikişi omuz kemiğine oturur; düşük omuzlu ve oversize kesimlerde göğüs genişliğine ve kol boyuna bakılır. Kalıplar markadan markaya değiştiği için ürün sayfasındaki beden bilgisi en güvenilir kaynaktır. Boy tercihini ise kullanım belirler: bel hizasında biten kısa montlar yürürken ve araç kullanırken hareketi kısıtlamaz, kalçayı örten uzun montlar rüzgârı daha iyi keser.</w:t>
       </w:r>
     </w:p>
     <w:p>
@@ -2024,7 +2024,7 @@
           <w:color w:val="1A1A1A"/>
           <w:sz w:val="21"/>
         </w:rPr>
-        <w:t>Boyner'in kadın mont sayfasında modelleri ürün çeşidine, markaya, bedene, renge ve materyale göre filtreleyebilirsiniz. Önce montu giyeceğiniz mevsime uygun türü, ardından bedeninizi ve renk tercihinizi seçtiğinizde liste daralır. Ürün sayfalarındaki materyal bilgisi dolgunun ve dış kumaşın ne olduğunu, beden tablosu ise ölçüleri gösterir. Kararsız kaldığınızda Boyner Now ile montları teslimat adresinizde deneyip beğendiğinizi satın alabilirsiniz.</w:t>
+        <w:t>Boyner'in kadın mont sayfasında modelleri ürün çeşidine, markaya, bedene, renge ve materyale göre filtreleyebilirsiniz. Önce montu giyeceğiniz mevsime uygun türü, ardından bedeninizi ve renk tercihinizi seçtiğinizde liste daralır. Ürün sayfalarındaki materyal bilgisi dolgunun ve dış kumaşın ne olduğunu gösterir. Kararsız kaldığınızda Boyner Now ile montları teslimat adresinizde deneyip beğendiğinizi satın alabilirsiniz.</w:t>
       </w:r>
     </w:p>
     <w:p>
@@ -2123,7 +2123,7 @@
           <w:color w:val="1A1A1A"/>
           <w:sz w:val="21"/>
         </w:rPr>
-        <w:t>Hayır, montu çoğu zaman kendi bedeninizde alabilirsiniz; çünkü mont kalıplarında içine giyilecek kazak için pay bırakılır. Dar kalıplı bir kadın montunu kalın kazakla giyecekseniz bir beden büyüğünü deneyebilirsiniz. Karar vermeden önce ürün sayfasındaki beden tablosunu göğüs ölçünüzle karşılaştırabilirsiniz.</w:t>
+        <w:t>Hayır, montu çoğu zaman kendi bedeninizde alabilirsiniz; çünkü mont kalıplarında içine giyilecek kazak için pay bırakılır. Dar kalıplı bir kadın montunu kalın kazakla giyecekseniz bir beden büyüğünü deneyebilirsiniz. Karar vermeden önce ürün sayfasındaki beden bilgisini göğüs ölçünüzle karşılaştırabilirsiniz.</w:t>
       </w:r>
     </w:p>
     <w:p>

</xml_diff>